<commit_message>
Deck jurado super top: slide de IA generativa soberana (RAG) + panel; app validada (9/9 páginas)
Co-Authored-By: Claude Opus 4.8 (1M context) <noreply@anthropic.com>
</commit_message>
<xml_diff>
--- a/outputs/jurado_2026/03_AquaBosque_Guion_15_Minutos.docx
+++ b/outputs/jurado_2026/03_AquaBosque_Guion_15_Minutos.docx
@@ -582,7 +582,69 @@
         <w:pStyle w:val="Heading2"/>
       </w:pPr>
       <w:r>
-        <w:t>Diapositiva 10. La Aplicación Funcional</w:t>
+        <w:t>Diapositiva 10. IA Generativa Soberana · Asistente</w:t>
+      </w:r>
+    </w:p>
+    <w:p>
+      <w:pPr>
+        <w:pStyle w:val="ListBullet"/>
+      </w:pPr>
+      <w:r>
+        <w:t>Objetivo: Mostrar la capa de IA generativa soberana como diferenciador: frontera tecnológica sin exponer el dato del Estado.</w:t>
+      </w:r>
+    </w:p>
+    <w:p>
+      <w:pPr>
+        <w:pStyle w:val="ListBullet"/>
+      </w:pPr>
+      <w:r>
+        <w:t>Duración máxima: 1:30</w:t>
+      </w:r>
+    </w:p>
+    <w:p>
+      <w:pPr>
+        <w:pStyle w:val="ListBullet"/>
+      </w:pPr>
+      <w:r>
+        <w:t>Texto sugerido: Aquí está el diferenciador de frontera: un asistente de IA generativa que corre en NUESTRA infraestructura de GPU, no en una nube externa. Cualquier funcionario o ciudadano puede preguntarle al sistema y recibe una respuesta aterrizada en la evidencia, con soberanía total del dato. Es exactamente el tipo de IA que el concurso premia, hecha de forma responsable para lo público.</w:t>
+      </w:r>
+    </w:p>
+    <w:p>
+      <w:pPr>
+        <w:pStyle w:val="ListBullet"/>
+      </w:pPr>
+      <w:r>
+        <w:t>Mensaje para el jurado: Tenemos IA generativa de frontera corriendo en infraestructura pública propia, con soberanía del dato.</w:t>
+      </w:r>
+    </w:p>
+    <w:p>
+      <w:pPr>
+        <w:pStyle w:val="ListBullet"/>
+      </w:pPr>
+      <w:r>
+        <w:t>Transición: Con las tres capas de IA mostradas, paso a la aplicación funcional donde todo se consulta.</w:t>
+      </w:r>
+    </w:p>
+    <w:p>
+      <w:pPr>
+        <w:pStyle w:val="ListBullet"/>
+      </w:pPr>
+      <w:r>
+        <w:t>Posibles preguntas:</w:t>
+      </w:r>
+    </w:p>
+    <w:p>
+      <w:r>
+        <w:t xml:space="preserve">  - ¿Usan ChatGPT / una nube externa? → No. Usamos modelos abiertos (Llama, Qwen) alojados en las L40S del Ministerio. El dato nunca sale de la infraestructura del Estado — un requisito clave en lo público.</w:t>
+      </w:r>
+    </w:p>
+    <w:p/>
+    <w:p>
+      <w:pPr>
+        <w:pStyle w:val="Heading2"/>
+      </w:pPr>
+      <w:r>
+        <w:t>Diapositiva 11. La Aplicación Funcional</w:t>
       </w:r>
     </w:p>
     <w:p>
@@ -644,7 +706,7 @@
         <w:pStyle w:val="Heading2"/>
       </w:pPr>
       <w:r>
-        <w:t>Diapositiva 11. Demostración Del Producto</w:t>
+        <w:t>Diapositiva 12. Demostración Del Producto</w:t>
       </w:r>
     </w:p>
     <w:p>
@@ -706,7 +768,7 @@
         <w:pStyle w:val="Heading2"/>
       </w:pPr>
       <w:r>
-        <w:t>Diapositiva 12. Caso De Uso Institucional</w:t>
+        <w:t>Diapositiva 13. Caso De Uso Institucional</w:t>
       </w:r>
     </w:p>
     <w:p>
@@ -768,7 +830,7 @@
         <w:pStyle w:val="Heading2"/>
       </w:pPr>
       <w:r>
-        <w:t>Diapositiva 13. Qué Valida El MVP</w:t>
+        <w:t>Diapositiva 14. Qué Valida El MVP</w:t>
       </w:r>
     </w:p>
     <w:p>
@@ -830,7 +892,7 @@
         <w:pStyle w:val="Heading2"/>
       </w:pPr>
       <w:r>
-        <w:t>Diapositiva 14. Escalamiento</w:t>
+        <w:t>Diapositiva 15. Escalamiento</w:t>
       </w:r>
     </w:p>
     <w:p>
@@ -892,7 +954,7 @@
         <w:pStyle w:val="Heading2"/>
       </w:pPr>
       <w:r>
-        <w:t>Diapositiva 15. Impacto Potencial</w:t>
+        <w:t>Diapositiva 16. Impacto Potencial</w:t>
       </w:r>
     </w:p>
     <w:p>
@@ -954,7 +1016,7 @@
         <w:pStyle w:val="Heading2"/>
       </w:pPr>
       <w:r>
-        <w:t>Diapositiva 16. Cierre</w:t>
+        <w:t>Diapositiva 17. Cierre</w:t>
       </w:r>
     </w:p>
     <w:p>

</xml_diff>